<commit_message>
docx-export 5.0.6: kbr, hr-style
Ref: https://github.com/sntl-projects/neon/issues/60
</commit_message>
<xml_diff>
--- a/Products/zms/conf/metacmd_manager/manage_export_pydocx/neon.docx
+++ b/Products/zms/conf/metacmd_manager/manage_export_pydocx/neon.docx
@@ -698,14 +698,12 @@
     <w:lsdException w:name="Normal" w:uiPriority="0"/>
     <w:lsdException w:name="Default Paragraph Font" w:uiPriority="1"/>
     <w:lsdException w:name="Title" w:uiPriority="10"/>
-    <w:lsdException w:name="heading 1" w:uiPriority="9" w:aliases="Heading_1,Heading1"/>
-    <w:lsdException w:name="heading 2" w:uiPriority="9" w:aliases="Heading_2,Heading2"/>
-    <w:lsdException w:name="heading 3" w:uiPriority="9" w:aliases="heading_3,Heading3"/>
-    <w:lsdException w:name="heading 4" w:uiPriority="9" w:aliases="heading_4,Heading4"/>
-    <w:lsdException w:name="heading 5" w:uiPriority="9" w:aliases="heading_5,Heading5"/>
-    <w:lsdException w:name="heading 6" w:uiPriority="9" w:aliases="heading_6,Heading6"/>
-    <w:lsdException w:name="heading 7" w:uiPriority="9" w:aliases="heading_7,Heading7"/>
-    <w:lsdException w:name="heading 8" w:uiPriority="9" w:aliases="heading_8,Heading8"/>
+    <w:lsdException w:name="heading 1" w:uiPriority="9"/>
+    <w:lsdException w:name="heading 2" w:uiPriority="9"/>
+    <w:lsdException w:name="heading 3" w:uiPriority="9"/>
+    <w:lsdException w:name="heading 4" w:uiPriority="9"/>
+    <w:lsdException w:name="heading 5" w:uiPriority="9"/>
+    <w:lsdException w:name="heading 6" w:uiPriority="9"/>
     <w:lsdException w:name="header"/>
     <w:lsdException w:name="footer"/>
     <w:lsdException w:name="caption" w:uiPriority="21"/>
@@ -873,46 +871,6 @@
       <w:sz w:val="18"/>
     </w:rPr>
   </w:style>
-  <w:style w:type="paragraph" w:styleId="berschrift7">
-    <w:name w:val="heading 7"/>
-    <w:basedOn w:val="Standard"/>
-    <w:next w:val="Standard"/>
-    <w:link w:val="berschrift7Zchn"/>
-    <w:uiPriority w:val="9"/>
-    <w:unhideWhenUsed/>
-    <w:qFormat/>
-    <w:pPr>
-      <w:keepNext/>
-      <w:keepLines/>
-      <w:spacing w:before="200" w:after="0"/>
-      <w:outlineLvl w:val="5"/>
-    </w:pPr>
-    <w:rPr>
-      <w:bCs w:val="0"/>
-      <w:iCs/>
-      <w:sz w:val="18"/>
-    </w:rPr>
-  </w:style>
-  <w:style w:type="paragraph" w:styleId="berschrift8">
-    <w:name w:val="heading 8"/>
-    <w:basedOn w:val="Standard"/>
-    <w:next w:val="Standard"/>
-    <w:link w:val="berschrift8Zchn"/>
-    <w:uiPriority w:val="10"/>
-    <w:unhideWhenUsed/>
-    <w:qFormat/>
-    <w:pPr>
-      <w:keepNext/>
-      <w:keepLines/>
-      <w:spacing w:before="200" w:after="0"/>
-      <w:outlineLvl w:val="5"/>
-    </w:pPr>
-    <w:rPr>
-      <w:bCs w:val="0"/>
-      <w:iCs/>
-      <w:sz w:val="18"/>
-    </w:rPr>
-  </w:style>
   <w:style w:type="character" w:styleId="Hyperlink">
     <w:name w:val="Hyperlink"/>
     <w:basedOn w:val="Absatz-Standardschriftart"/>
@@ -949,10 +907,9 @@
     <w:rPr>
       <w:rFonts w:ascii="Courier New" w:hAnsi="Courier New"/>
       <w:b/>
-      <w:color w:val="EEEEEE"/>
-      <w:sz w:val="16"/>
-      <w:bdr w:val="single" w:sz="20" w:space="0" w:color="000000"/>
-      <w:shd w:val="clear" w:color="auto" w:fill="000000"/>
+      <w:color w:val="auto"/>
+      <w:sz w:val="18"/>
+      <w:bdr w:val="single" w:sz="12" w:space="0" w:color="000000" w:shadow="1"/>
     </w:rPr>
   </w:style>
   <w:style w:type="paragraph" w:styleId="Liste">
@@ -1224,6 +1181,23 @@
         <w:tab w:val="left" w:pos="0"/>
       </w:tabs>
     </w:pPr>
+  </w:style>
+  <w:style w:type="paragraph" w:styleId="HorizontaleLinie">
+    <w:name w:val="Horizontale Linie"/>
+    <w:basedOn w:val="Normal"/>
+    <w:next w:val="Standard"/>
+    <w:qFormat/>
+    <w:pPr>
+      <w:suppressLineNumbers/>
+      <w:pBdr>
+        <w:bottom w:val="single" w:sz="2" w:space="0" w:color="808080"/>
+      </w:pBdr>
+      <w:spacing w:before="120" w:after="280"/>
+    </w:pPr>
+    <w:rPr>
+      <w:sz w:val="12"/>
+      <w:szCs w:val="12"/>
+    </w:rPr>
   </w:style>
   <w:style w:type="paragraph" w:customStyle="1" w:styleId="Grundsatz">
     <w:name w:val="Grundsatz"/>

</xml_diff>

<commit_message>
update meta-cmd export_pydocx 5.1.1
Ref: https://github.com/sntl-projects/neon/issues/60
</commit_message>
<xml_diff>
--- a/Products/zms/conf/metacmd_manager/manage_export_pydocx/neon.docx
+++ b/Products/zms/conf/metacmd_manager/manage_export_pydocx/neon.docx
@@ -517,7 +517,7 @@
       <w:start w:val="1"/>
       <w:numFmt w:val="decimal"/>
       <w:lvlText w:val="%1."/>
-      <w:lvlJc w:val="left"/>
+      <w:lvlJc w:val="start"/>
       <w:pPr>
         <w:tabs>
           <w:tab w:val="num" w:pos="360"/>
@@ -532,7 +532,7 @@
       <w:start w:val="1"/>
       <w:numFmt w:val="decimal"/>
       <w:lvlText w:val="%2."/>
-      <w:lvlJc w:val="left"/>
+      <w:lvlJc w:val="start"/>
       <w:pPr>
         <w:tabs>
           <w:tab w:val="num" w:pos="720"/>
@@ -545,7 +545,7 @@
       <w:start w:val="1"/>
       <w:numFmt w:val="decimal"/>
       <w:lvlText w:val="%3."/>
-      <w:lvlJc w:val="left"/>
+      <w:lvlJc w:val="start"/>
       <w:pPr>
         <w:tabs>
           <w:tab w:val="num" w:pos="1080"/>
@@ -558,7 +558,7 @@
       <w:start w:val="1"/>
       <w:numFmt w:val="decimal"/>
       <w:lvlText w:val="%4."/>
-      <w:lvlJc w:val="left"/>
+      <w:lvlJc w:val="start"/>
       <w:pPr>
         <w:tabs>
           <w:tab w:val="num" w:pos="1440"/>
@@ -571,7 +571,7 @@
       <w:start w:val="1"/>
       <w:numFmt w:val="decimal"/>
       <w:lvlText w:val="%5."/>
-      <w:lvlJc w:val="left"/>
+      <w:lvlJc w:val="start"/>
       <w:pPr>
         <w:tabs>
           <w:tab w:val="num" w:pos="1800"/>
@@ -584,7 +584,7 @@
       <w:start w:val="1"/>
       <w:numFmt w:val="decimal"/>
       <w:lvlText w:val="%6."/>
-      <w:lvlJc w:val="left"/>
+      <w:lvlJc w:val="start"/>
       <w:pPr>
         <w:tabs>
           <w:tab w:val="num" w:pos="2160"/>
@@ -597,7 +597,7 @@
       <w:start w:val="1"/>
       <w:numFmt w:val="decimal"/>
       <w:lvlText w:val="%7."/>
-      <w:lvlJc w:val="left"/>
+      <w:lvlJc w:val="start"/>
       <w:pPr>
         <w:tabs>
           <w:tab w:val="num" w:pos="2420"/>
@@ -610,7 +610,7 @@
       <w:start w:val="1"/>
       <w:numFmt w:val="decimal"/>
       <w:lvlText w:val="%8."/>
-      <w:lvlJc w:val="left"/>
+      <w:lvlJc w:val="start"/>
       <w:pPr>
         <w:tabs>
           <w:tab w:val="num" w:pos="2780"/>
@@ -623,7 +623,7 @@
       <w:start w:val="1"/>
       <w:numFmt w:val="decimal"/>
       <w:lvlText w:val="%9."/>
-      <w:lvlJc w:val="left"/>
+      <w:lvlJc w:val="start"/>
       <w:pPr>
         <w:tabs>
           <w:tab w:val="num" w:pos="3040"/>
@@ -666,14 +666,6 @@
   <w:num w:numId="4">
     <w:abstractNumId w:val="4"/>
   </w:num>
-  <!--
-	<w:num w:numId="5">
-		<w:abstractNumId w:val="3"/>
-		<w:lvlOverride w:ilvl="0">
-			<w:startOverride w:val="1"/>
-		</w:lvlOverride>
-	</w:num>
--->
 </w:numbering>
 </file>
 

</xml_diff>

<commit_message>
update meta-cmd export_pydocx 5.1.2
Ref: https://github.com/sntl-projects/neon/issues/60
</commit_message>
<xml_diff>
--- a/Products/zms/conf/metacmd_manager/manage_export_pydocx/neon.docx
+++ b/Products/zms/conf/metacmd_manager/manage_export_pydocx/neon.docx
@@ -696,6 +696,10 @@
     <w:lsdException w:name="heading 4" w:uiPriority="9"/>
     <w:lsdException w:name="heading 5" w:uiPriority="9"/>
     <w:lsdException w:name="heading 6" w:uiPriority="9"/>
+    <w:lsdException w:name="heading 7" w:uiPriority="9"/>
+    <w:lsdException w:name="heading 8" w:uiPriority="9"/>
+    <w:lsdException w:name="heading 9" w:uiPriority="9"/>
+    <w:lsdException w:name="heading 10" w:uiPriority="9"/>
     <w:lsdException w:name="header"/>
     <w:lsdException w:name="footer"/>
     <w:lsdException w:name="caption" w:uiPriority="21"/>
@@ -844,7 +848,7 @@
   </w:style>
   <w:style w:type="paragraph" w:styleId="berschrift6">
     <w:name w:val="heading 6"/>
-    <w:basedOn w:val="Standard"/>
+    <w:basedOn w:val="berschrift1"/>
     <w:next w:val="Standard"/>
     <w:link w:val="berschrift6Zchn"/>
     <w:uiPriority w:val="8"/>
@@ -858,7 +862,86 @@
     </w:pPr>
     <w:rPr>
       <w:bCs w:val="0"/>
-      <w:u w:val="single"/>
+      <w:iCs/>
+      <w:sz w:val="18"/>
+    </w:rPr>
+  </w:style>
+  <w:style w:type="paragraph" w:styleId="berschrift7">
+    <w:name w:val="heading 7"/>
+    <w:basedOn w:val="berschrift1"/>
+    <w:next w:val="Standard"/>
+    <w:link w:val="berschrift7Zchn"/>
+    <w:uiPriority w:val="9"/>
+    <w:unhideWhenUsed/>
+    <w:qFormat/>
+    <w:pPr>
+      <w:keepNext/>
+      <w:keepLines/>
+      <w:spacing w:before="200" w:after="0"/>
+      <w:outlineLvl w:val="6"/>
+    </w:pPr>
+    <w:rPr>
+      <w:bCs w:val="0"/>
+      <w:iCs/>
+      <w:sz w:val="18"/>
+    </w:rPr>
+  </w:style>
+  <w:style w:type="paragraph" w:styleId="berschrift8">
+    <w:name w:val="heading 8"/>
+    <w:basedOn w:val="berschrift1"/>
+    <w:next w:val="Standard"/>
+    <w:link w:val="berschrift8Zchn"/>
+    <w:uiPriority w:val="10"/>
+    <w:unhideWhenUsed/>
+    <w:qFormat/>
+    <w:pPr>
+      <w:keepNext/>
+      <w:keepLines/>
+      <w:spacing w:before="200" w:after="0"/>
+      <w:outlineLvl w:val="7"/>
+    </w:pPr>
+    <w:rPr>
+      <w:bCs w:val="0"/>
+      <w:iCs/>
+      <w:sz w:val="18"/>
+    </w:rPr>
+  </w:style>
+  <w:style w:type="paragraph" w:styleId="berschrift9">
+    <w:name w:val="heading 9"/>
+    <w:basedOn w:val="berschrift1"/>
+    <w:next w:val="Standard"/>
+    <w:link w:val="berschrift9Zchn"/>
+    <w:uiPriority w:val="11"/>
+    <w:unhideWhenUsed/>
+    <w:qFormat/>
+    <w:pPr>
+      <w:keepNext/>
+      <w:keepLines/>
+      <w:spacing w:before="200" w:after="0"/>
+      <w:outlineLvl w:val="8"/>
+    </w:pPr>
+    <w:rPr>
+      <w:bCs w:val="0"/>
+      <w:iCs/>
+      <w:sz w:val="18"/>
+    </w:rPr>
+  </w:style>
+  <w:style w:type="paragraph" w:styleId="berschrift10">
+    <w:name w:val="heading 10"/>
+    <w:basedOn w:val="berschrift1"/>
+    <w:next w:val="Standard"/>
+    <w:link w:val="berschrift10Zchn"/>
+    <w:uiPriority w:val="12"/>
+    <w:unhideWhenUsed/>
+    <w:qFormat/>
+    <w:pPr>
+      <w:keepNext/>
+      <w:keepLines/>
+      <w:spacing w:before="200" w:after="0"/>
+      <w:outlineLvl w:val="9"/>
+    </w:pPr>
+    <w:rPr>
+      <w:bCs w:val="0"/>
       <w:iCs/>
       <w:sz w:val="18"/>
     </w:rPr>

</xml_diff>